<commit_message>
Brief: Layout überlebt das Einsetzen in fremde Word-Dokumente
Beim Einsetzen einer Vorlage ersetzt Word die Formatvorlagen gleichen
Namens durch die des Zieldokuments – ein frisches Word bringt 8 pt
Absatzabstand, Zeilenabstand 1.16 und eine blaue «Überschrift 1» mit.
Genau so sah der erste Brief bei der Linde aus.

Brief neu auf eigene Formatvorlagen «Linde Brief/Betreff/Kopfzeile/
Fusszeile» gebaut (Abstand 0, einfacher Zeilenabstand, Aptos 11/12,
schwarz), Logo mittig, Aufbau und Leerzeilen wie das freigegebene Muster.
Das Add-In übergibt beim Einsetzen zusätzlich importStyles,
importParagraphSpacing und importTheme (WordApi 1.5) – gilt für alle
Vorlagen – und fällt ohne Optionen bzw. auf den Rumpf zurück. Build 10.

Co-Authored-By: Claude Fable 5.1 <noreply@anthropic.com>
Claude-Session: https://claude.ai/code/session_01MKgoxsRTHsXqpCfajJxuB7
</commit_message>
<xml_diff>
--- a/vorlagen/brief.docx
+++ b/vorlagen/brief.docx
@@ -4,10 +4,25 @@
   <w:body>
     <w:p>
       <w:pPr>
+        <w:pStyle w:val="LindeBrief"/>
         <w:spacing w:before="0" w:after="0" w:line="240" w:lineRule="auto"/>
         <w:ind w:left="5040"/>
         <w:rPr>
           <w:rFonts w:ascii="Aptos" w:hAnsi="Aptos" w:cs="Aptos"/>
+          <w:color w:val="000000"/>
+          <w:sz w:val="22"/>
+          <w:szCs w:val="22"/>
+        </w:rPr>
+      </w:pPr>
+    </w:p>
+    <w:p>
+      <w:pPr>
+        <w:pStyle w:val="LindeBrief"/>
+        <w:spacing w:before="0" w:after="0" w:line="240" w:lineRule="auto"/>
+        <w:ind w:left="5040"/>
+        <w:rPr>
+          <w:rFonts w:ascii="Aptos" w:hAnsi="Aptos" w:cs="Aptos"/>
+          <w:color w:val="000000"/>
           <w:sz w:val="22"/>
           <w:szCs w:val="22"/>
         </w:rPr>
@@ -15,6 +30,7 @@
       <w:r>
         <w:rPr>
           <w:rFonts w:ascii="Aptos" w:hAnsi="Aptos" w:cs="Aptos"/>
+          <w:color w:val="000000"/>
           <w:sz w:val="22"/>
           <w:szCs w:val="22"/>
         </w:rPr>
@@ -23,10 +39,12 @@
     </w:p>
     <w:p>
       <w:pPr>
+        <w:pStyle w:val="LindeBrief"/>
         <w:spacing w:before="0" w:after="0" w:line="240" w:lineRule="auto"/>
         <w:ind w:left="5040"/>
         <w:rPr>
           <w:rFonts w:ascii="Aptos" w:hAnsi="Aptos" w:cs="Aptos"/>
+          <w:color w:val="000000"/>
           <w:sz w:val="22"/>
           <w:szCs w:val="22"/>
         </w:rPr>
@@ -34,6 +52,7 @@
       <w:r>
         <w:rPr>
           <w:rFonts w:ascii="Aptos" w:hAnsi="Aptos" w:cs="Aptos"/>
+          <w:color w:val="000000"/>
           <w:sz w:val="22"/>
           <w:szCs w:val="22"/>
         </w:rPr>
@@ -42,10 +61,12 @@
     </w:p>
     <w:p>
       <w:pPr>
+        <w:pStyle w:val="LindeBrief"/>
         <w:spacing w:before="0" w:after="0" w:line="240" w:lineRule="auto"/>
         <w:ind w:left="5040"/>
         <w:rPr>
           <w:rFonts w:ascii="Aptos" w:hAnsi="Aptos" w:cs="Aptos"/>
+          <w:color w:val="000000"/>
           <w:sz w:val="22"/>
           <w:szCs w:val="22"/>
         </w:rPr>
@@ -53,6 +74,7 @@
       <w:r>
         <w:rPr>
           <w:rFonts w:ascii="Aptos" w:hAnsi="Aptos" w:cs="Aptos"/>
+          <w:color w:val="000000"/>
           <w:sz w:val="22"/>
           <w:szCs w:val="22"/>
         </w:rPr>
@@ -61,10 +83,12 @@
     </w:p>
     <w:p>
       <w:pPr>
+        <w:pStyle w:val="LindeBrief"/>
         <w:spacing w:before="0" w:after="0" w:line="240" w:lineRule="auto"/>
         <w:ind w:left="5040"/>
         <w:rPr>
           <w:rFonts w:ascii="Aptos" w:hAnsi="Aptos" w:cs="Aptos"/>
+          <w:color w:val="000000"/>
           <w:sz w:val="22"/>
           <w:szCs w:val="22"/>
         </w:rPr>
@@ -72,6 +96,7 @@
       <w:r>
         <w:rPr>
           <w:rFonts w:ascii="Aptos" w:hAnsi="Aptos" w:cs="Aptos"/>
+          <w:color w:val="000000"/>
           <w:sz w:val="22"/>
           <w:szCs w:val="22"/>
         </w:rPr>
@@ -80,30 +105,48 @@
     </w:p>
     <w:p>
       <w:pPr>
-        <w:spacing w:before="0" w:after="0" w:line="240" w:lineRule="auto"/>
-        <w:rPr>
-          <w:rFonts w:ascii="Aptos" w:hAnsi="Aptos" w:cs="Aptos"/>
-          <w:sz w:val="22"/>
-          <w:szCs w:val="22"/>
-        </w:rPr>
-      </w:pPr>
-    </w:p>
-    <w:p>
-      <w:pPr>
-        <w:spacing w:before="0" w:after="0" w:line="240" w:lineRule="auto"/>
-        <w:rPr>
-          <w:rFonts w:ascii="Aptos" w:hAnsi="Aptos" w:cs="Aptos"/>
-          <w:sz w:val="22"/>
-          <w:szCs w:val="22"/>
-        </w:rPr>
-      </w:pPr>
-    </w:p>
-    <w:p>
-      <w:pPr>
+        <w:pStyle w:val="LindeBrief"/>
+        <w:spacing w:before="0" w:after="0" w:line="240" w:lineRule="auto"/>
+        <w:rPr>
+          <w:rFonts w:ascii="Aptos" w:hAnsi="Aptos" w:cs="Aptos"/>
+          <w:color w:val="000000"/>
+          <w:sz w:val="22"/>
+          <w:szCs w:val="22"/>
+        </w:rPr>
+      </w:pPr>
+    </w:p>
+    <w:p>
+      <w:pPr>
+        <w:pStyle w:val="LindeBrief"/>
+        <w:spacing w:before="0" w:after="0" w:line="240" w:lineRule="auto"/>
+        <w:rPr>
+          <w:rFonts w:ascii="Aptos" w:hAnsi="Aptos" w:cs="Aptos"/>
+          <w:color w:val="000000"/>
+          <w:sz w:val="22"/>
+          <w:szCs w:val="22"/>
+        </w:rPr>
+      </w:pPr>
+    </w:p>
+    <w:p>
+      <w:pPr>
+        <w:pStyle w:val="LindeBrief"/>
+        <w:spacing w:before="0" w:after="0" w:line="240" w:lineRule="auto"/>
+        <w:rPr>
+          <w:rFonts w:ascii="Aptos" w:hAnsi="Aptos" w:cs="Aptos"/>
+          <w:color w:val="000000"/>
+          <w:sz w:val="22"/>
+          <w:szCs w:val="22"/>
+        </w:rPr>
+      </w:pPr>
+    </w:p>
+    <w:p>
+      <w:pPr>
+        <w:pStyle w:val="LindeBrief"/>
         <w:spacing w:before="0" w:after="0" w:line="240" w:lineRule="auto"/>
         <w:ind w:left="5040"/>
         <w:rPr>
           <w:rFonts w:ascii="Aptos" w:hAnsi="Aptos" w:cs="Aptos"/>
+          <w:color w:val="000000"/>
           <w:sz w:val="22"/>
           <w:szCs w:val="22"/>
         </w:rPr>
@@ -111,6 +154,7 @@
       <w:r>
         <w:rPr>
           <w:rFonts w:ascii="Aptos" w:hAnsi="Aptos" w:cs="Aptos"/>
+          <w:color w:val="000000"/>
           <w:sz w:val="22"/>
           <w:szCs w:val="22"/>
         </w:rPr>
@@ -119,32 +163,37 @@
     </w:p>
     <w:p>
       <w:pPr>
-        <w:spacing w:before="0" w:after="0" w:line="240" w:lineRule="auto"/>
-        <w:rPr>
-          <w:rFonts w:ascii="Aptos" w:hAnsi="Aptos" w:cs="Aptos"/>
-          <w:sz w:val="22"/>
-          <w:szCs w:val="22"/>
-        </w:rPr>
-      </w:pPr>
-    </w:p>
-    <w:p>
-      <w:pPr>
-        <w:spacing w:before="0" w:after="0" w:line="240" w:lineRule="auto"/>
-        <w:rPr>
-          <w:rFonts w:ascii="Aptos" w:hAnsi="Aptos" w:cs="Aptos"/>
-          <w:sz w:val="22"/>
-          <w:szCs w:val="22"/>
-        </w:rPr>
-      </w:pPr>
-    </w:p>
-    <w:p>
-      <w:pPr>
-        <w:pStyle w:val="berschrift1"/>
+        <w:pStyle w:val="LindeBrief"/>
+        <w:spacing w:before="0" w:after="0" w:line="240" w:lineRule="auto"/>
+        <w:rPr>
+          <w:rFonts w:ascii="Aptos" w:hAnsi="Aptos" w:cs="Aptos"/>
+          <w:color w:val="000000"/>
+          <w:sz w:val="22"/>
+          <w:szCs w:val="22"/>
+        </w:rPr>
+      </w:pPr>
+    </w:p>
+    <w:p>
+      <w:pPr>
+        <w:pStyle w:val="LindeBrief"/>
+        <w:spacing w:before="0" w:after="0" w:line="240" w:lineRule="auto"/>
+        <w:rPr>
+          <w:rFonts w:ascii="Aptos" w:hAnsi="Aptos" w:cs="Aptos"/>
+          <w:color w:val="000000"/>
+          <w:sz w:val="22"/>
+          <w:szCs w:val="22"/>
+        </w:rPr>
+      </w:pPr>
+    </w:p>
+    <w:p>
+      <w:pPr>
+        <w:pStyle w:val="LindeBetreff"/>
         <w:spacing w:before="0" w:after="0" w:line="240" w:lineRule="auto"/>
         <w:rPr>
           <w:rFonts w:ascii="Aptos" w:hAnsi="Aptos" w:cs="Aptos"/>
           <w:b/>
           <w:bCs/>
+          <w:color w:val="000000"/>
           <w:sz w:val="24"/>
           <w:szCs w:val="24"/>
         </w:rPr>
@@ -154,6 +203,7 @@
           <w:rFonts w:ascii="Aptos" w:hAnsi="Aptos" w:cs="Aptos"/>
           <w:b/>
           <w:bCs/>
+          <w:color w:val="000000"/>
           <w:sz w:val="24"/>
           <w:szCs w:val="24"/>
         </w:rPr>
@@ -162,19 +212,23 @@
     </w:p>
     <w:p>
       <w:pPr>
-        <w:spacing w:before="0" w:after="0" w:line="240" w:lineRule="auto"/>
-        <w:rPr>
-          <w:rFonts w:ascii="Aptos" w:hAnsi="Aptos" w:cs="Aptos"/>
-          <w:sz w:val="22"/>
-          <w:szCs w:val="22"/>
-        </w:rPr>
-      </w:pPr>
-    </w:p>
-    <w:p>
-      <w:pPr>
-        <w:spacing w:before="0" w:after="0" w:line="240" w:lineRule="auto"/>
-        <w:rPr>
-          <w:rFonts w:ascii="Aptos" w:hAnsi="Aptos" w:cs="Aptos"/>
+        <w:pStyle w:val="LindeBrief"/>
+        <w:spacing w:before="0" w:after="0" w:line="240" w:lineRule="auto"/>
+        <w:rPr>
+          <w:rFonts w:ascii="Aptos" w:hAnsi="Aptos" w:cs="Aptos"/>
+          <w:color w:val="000000"/>
+          <w:sz w:val="22"/>
+          <w:szCs w:val="22"/>
+        </w:rPr>
+      </w:pPr>
+    </w:p>
+    <w:p>
+      <w:pPr>
+        <w:pStyle w:val="LindeBrief"/>
+        <w:spacing w:before="0" w:after="0" w:line="240" w:lineRule="auto"/>
+        <w:rPr>
+          <w:rFonts w:ascii="Aptos" w:hAnsi="Aptos" w:cs="Aptos"/>
+          <w:color w:val="000000"/>
           <w:sz w:val="22"/>
           <w:szCs w:val="22"/>
         </w:rPr>
@@ -182,6 +236,7 @@
       <w:r>
         <w:rPr>
           <w:rFonts w:ascii="Aptos" w:hAnsi="Aptos" w:cs="Aptos"/>
+          <w:color w:val="000000"/>
           <w:sz w:val="22"/>
           <w:szCs w:val="22"/>
         </w:rPr>
@@ -190,19 +245,23 @@
     </w:p>
     <w:p>
       <w:pPr>
-        <w:spacing w:before="0" w:after="0" w:line="240" w:lineRule="auto"/>
-        <w:rPr>
-          <w:rFonts w:ascii="Aptos" w:hAnsi="Aptos" w:cs="Aptos"/>
-          <w:sz w:val="22"/>
-          <w:szCs w:val="22"/>
-        </w:rPr>
-      </w:pPr>
-    </w:p>
-    <w:p>
-      <w:pPr>
-        <w:spacing w:before="0" w:after="0" w:line="240" w:lineRule="auto"/>
-        <w:rPr>
-          <w:rFonts w:ascii="Aptos" w:hAnsi="Aptos" w:cs="Aptos"/>
+        <w:pStyle w:val="LindeBrief"/>
+        <w:spacing w:before="0" w:after="0" w:line="240" w:lineRule="auto"/>
+        <w:rPr>
+          <w:rFonts w:ascii="Aptos" w:hAnsi="Aptos" w:cs="Aptos"/>
+          <w:color w:val="000000"/>
+          <w:sz w:val="22"/>
+          <w:szCs w:val="22"/>
+        </w:rPr>
+      </w:pPr>
+    </w:p>
+    <w:p>
+      <w:pPr>
+        <w:pStyle w:val="LindeBrief"/>
+        <w:spacing w:before="0" w:after="0" w:line="240" w:lineRule="auto"/>
+        <w:rPr>
+          <w:rFonts w:ascii="Aptos" w:hAnsi="Aptos" w:cs="Aptos"/>
+          <w:color w:val="000000"/>
           <w:sz w:val="22"/>
           <w:szCs w:val="22"/>
         </w:rPr>
@@ -210,6 +269,7 @@
       <w:r>
         <w:rPr>
           <w:rFonts w:ascii="Aptos" w:hAnsi="Aptos" w:cs="Aptos"/>
+          <w:color w:val="000000"/>
           <w:sz w:val="22"/>
           <w:szCs w:val="22"/>
         </w:rPr>
@@ -218,29 +278,35 @@
     </w:p>
     <w:p>
       <w:pPr>
-        <w:spacing w:before="0" w:after="0" w:line="240" w:lineRule="auto"/>
-        <w:rPr>
-          <w:rFonts w:ascii="Aptos" w:hAnsi="Aptos" w:cs="Aptos"/>
-          <w:sz w:val="22"/>
-          <w:szCs w:val="22"/>
-        </w:rPr>
-      </w:pPr>
-    </w:p>
-    <w:p>
-      <w:pPr>
-        <w:spacing w:before="0" w:after="0" w:line="240" w:lineRule="auto"/>
-        <w:rPr>
-          <w:rFonts w:ascii="Aptos" w:hAnsi="Aptos" w:cs="Aptos"/>
-          <w:sz w:val="22"/>
-          <w:szCs w:val="22"/>
-        </w:rPr>
-      </w:pPr>
-    </w:p>
-    <w:p>
-      <w:pPr>
-        <w:spacing w:before="0" w:after="0" w:line="240" w:lineRule="auto"/>
-        <w:rPr>
-          <w:rFonts w:ascii="Aptos" w:hAnsi="Aptos" w:cs="Aptos"/>
+        <w:pStyle w:val="LindeBrief"/>
+        <w:spacing w:before="0" w:after="0" w:line="240" w:lineRule="auto"/>
+        <w:rPr>
+          <w:rFonts w:ascii="Aptos" w:hAnsi="Aptos" w:cs="Aptos"/>
+          <w:color w:val="000000"/>
+          <w:sz w:val="22"/>
+          <w:szCs w:val="22"/>
+        </w:rPr>
+      </w:pPr>
+    </w:p>
+    <w:p>
+      <w:pPr>
+        <w:pStyle w:val="LindeBrief"/>
+        <w:spacing w:before="0" w:after="0" w:line="240" w:lineRule="auto"/>
+        <w:rPr>
+          <w:rFonts w:ascii="Aptos" w:hAnsi="Aptos" w:cs="Aptos"/>
+          <w:color w:val="000000"/>
+          <w:sz w:val="22"/>
+          <w:szCs w:val="22"/>
+        </w:rPr>
+      </w:pPr>
+    </w:p>
+    <w:p>
+      <w:pPr>
+        <w:pStyle w:val="LindeBrief"/>
+        <w:spacing w:before="0" w:after="0" w:line="240" w:lineRule="auto"/>
+        <w:rPr>
+          <w:rFonts w:ascii="Aptos" w:hAnsi="Aptos" w:cs="Aptos"/>
+          <w:color w:val="000000"/>
           <w:sz w:val="22"/>
           <w:szCs w:val="22"/>
         </w:rPr>
@@ -248,6 +314,7 @@
       <w:r>
         <w:rPr>
           <w:rFonts w:ascii="Aptos" w:hAnsi="Aptos" w:cs="Aptos"/>
+          <w:color w:val="000000"/>
           <w:sz w:val="22"/>
           <w:szCs w:val="22"/>
         </w:rPr>
@@ -256,11 +323,13 @@
     </w:p>
     <w:p>
       <w:pPr>
+        <w:pStyle w:val="LindeBrief"/>
         <w:spacing w:before="0" w:after="0" w:line="240" w:lineRule="auto"/>
         <w:rPr>
           <w:rFonts w:ascii="Aptos" w:hAnsi="Aptos" w:cs="Aptos"/>
           <w:b/>
           <w:bCs/>
+          <w:color w:val="000000"/>
           <w:sz w:val="22"/>
           <w:szCs w:val="22"/>
         </w:rPr>
@@ -270,6 +339,7 @@
           <w:rFonts w:ascii="Aptos" w:hAnsi="Aptos" w:cs="Aptos"/>
           <w:b/>
           <w:bCs/>
+          <w:color w:val="000000"/>
           <w:sz w:val="22"/>
           <w:szCs w:val="22"/>
         </w:rPr>
@@ -278,29 +348,35 @@
     </w:p>
     <w:p>
       <w:pPr>
-        <w:spacing w:before="0" w:after="0" w:line="240" w:lineRule="auto"/>
-        <w:rPr>
-          <w:rFonts w:ascii="Aptos" w:hAnsi="Aptos" w:cs="Aptos"/>
-          <w:sz w:val="22"/>
-          <w:szCs w:val="22"/>
-        </w:rPr>
-      </w:pPr>
-    </w:p>
-    <w:p>
-      <w:pPr>
-        <w:spacing w:before="0" w:after="0" w:line="240" w:lineRule="auto"/>
-        <w:rPr>
-          <w:rFonts w:ascii="Aptos" w:hAnsi="Aptos" w:cs="Aptos"/>
-          <w:sz w:val="22"/>
-          <w:szCs w:val="22"/>
-        </w:rPr>
-      </w:pPr>
-    </w:p>
-    <w:p>
-      <w:pPr>
-        <w:spacing w:before="0" w:after="0" w:line="240" w:lineRule="auto"/>
-        <w:rPr>
-          <w:rFonts w:ascii="Aptos" w:hAnsi="Aptos" w:cs="Aptos"/>
+        <w:pStyle w:val="LindeBrief"/>
+        <w:spacing w:before="0" w:after="0" w:line="240" w:lineRule="auto"/>
+        <w:rPr>
+          <w:rFonts w:ascii="Aptos" w:hAnsi="Aptos" w:cs="Aptos"/>
+          <w:color w:val="000000"/>
+          <w:sz w:val="22"/>
+          <w:szCs w:val="22"/>
+        </w:rPr>
+      </w:pPr>
+    </w:p>
+    <w:p>
+      <w:pPr>
+        <w:pStyle w:val="LindeBrief"/>
+        <w:spacing w:before="0" w:after="0" w:line="240" w:lineRule="auto"/>
+        <w:rPr>
+          <w:rFonts w:ascii="Aptos" w:hAnsi="Aptos" w:cs="Aptos"/>
+          <w:color w:val="000000"/>
+          <w:sz w:val="22"/>
+          <w:szCs w:val="22"/>
+        </w:rPr>
+      </w:pPr>
+    </w:p>
+    <w:p>
+      <w:pPr>
+        <w:pStyle w:val="LindeBrief"/>
+        <w:spacing w:before="0" w:after="0" w:line="240" w:lineRule="auto"/>
+        <w:rPr>
+          <w:rFonts w:ascii="Aptos" w:hAnsi="Aptos" w:cs="Aptos"/>
+          <w:color w:val="000000"/>
           <w:sz w:val="22"/>
           <w:szCs w:val="22"/>
         </w:rPr>
@@ -308,6 +384,7 @@
       <w:r>
         <w:rPr>
           <w:rFonts w:ascii="Aptos" w:hAnsi="Aptos" w:cs="Aptos"/>
+          <w:color w:val="000000"/>
           <w:sz w:val="22"/>
           <w:szCs w:val="22"/>
         </w:rPr>
@@ -316,9 +393,11 @@
     </w:p>
     <w:p>
       <w:pPr>
-        <w:spacing w:before="0" w:after="0" w:line="240" w:lineRule="auto"/>
-        <w:rPr>
-          <w:rFonts w:ascii="Aptos" w:hAnsi="Aptos" w:cs="Aptos"/>
+        <w:pStyle w:val="LindeBrief"/>
+        <w:spacing w:before="0" w:after="0" w:line="240" w:lineRule="auto"/>
+        <w:rPr>
+          <w:rFonts w:ascii="Aptos" w:hAnsi="Aptos" w:cs="Aptos"/>
+          <w:color w:val="000000"/>
           <w:sz w:val="22"/>
           <w:szCs w:val="22"/>
         </w:rPr>
@@ -326,6 +405,7 @@
       <w:r>
         <w:rPr>
           <w:rFonts w:ascii="Aptos" w:hAnsi="Aptos" w:cs="Aptos"/>
+          <w:color w:val="000000"/>
           <w:sz w:val="22"/>
           <w:szCs w:val="22"/>
         </w:rPr>
@@ -367,11 +447,12 @@
 <w:ftr xmlns:mc="http://schemas.openxmlformats.org/markup-compatibility/2006" xmlns:w="http://schemas.openxmlformats.org/wordprocessingml/2006/main" xmlns:w14="http://schemas.microsoft.com/office/word/2010/wordml" xmlns:wpc="http://schemas.microsoft.com/office/word/2010/wordprocessingCanvas" xmlns:cx="http://schemas.microsoft.com/office/drawing/2014/chartex" xmlns:cx1="http://schemas.microsoft.com/office/drawing/2015/9/8/chartex" xmlns:cx2="http://schemas.microsoft.com/office/drawing/2015/10/21/chartex" xmlns:cx3="http://schemas.microsoft.com/office/drawing/2016/5/9/chartex" xmlns:cx4="http://schemas.microsoft.com/office/drawing/2016/5/10/chartex" xmlns:cx5="http://schemas.microsoft.com/office/drawing/2016/5/11/chartex" xmlns:cx6="http://schemas.microsoft.com/office/drawing/2016/5/12/chartex" xmlns:cx7="http://schemas.microsoft.com/office/drawing/2016/5/13/chartex" xmlns:cx8="http://schemas.microsoft.com/office/drawing/2016/5/14/chartex" xmlns:aink="http://schemas.microsoft.com/office/drawing/2016/ink" xmlns:am3d="http://schemas.microsoft.com/office/drawing/2017/model3d" xmlns:o="urn:schemas-microsoft-com:office:office" xmlns:oel="http://schemas.microsoft.com/office/2019/extlst" xmlns:r="http://schemas.openxmlformats.org/officeDocument/2006/relationships" xmlns:m="http://schemas.openxmlformats.org/officeDocument/2006/math" xmlns:v="urn:schemas-microsoft-com:vml" xmlns:wp14="http://schemas.microsoft.com/office/word/2010/wordprocessingDrawing" xmlns:wp="http://schemas.openxmlformats.org/drawingml/2006/wordprocessingDrawing" xmlns:w10="urn:schemas-microsoft-com:office:word" xmlns:w15="http://schemas.microsoft.com/office/word/2012/wordml" xmlns:w16cei="http://schemas.microsoft.com/office/word/2026/wordml/cei" xmlns:w16cex="http://schemas.microsoft.com/office/word/2018/wordml/cex" xmlns:w16cid="http://schemas.microsoft.com/office/word/2016/wordml/cid" xmlns:w16="http://schemas.microsoft.com/office/word/2018/wordml" xmlns:w16du="http://schemas.microsoft.com/office/word/2023/wordml/word16du" xmlns:w16sdtdh="http://schemas.microsoft.com/office/word/2020/wordml/sdtdatahash" xmlns:w16sdtfl="http://schemas.microsoft.com/office/word/2024/wordml/sdtformatlock" xmlns:w16se="http://schemas.microsoft.com/office/word/2015/wordml/symex" xmlns:wpg="http://schemas.microsoft.com/office/word/2010/wordprocessingGroup" xmlns:wpi="http://schemas.microsoft.com/office/word/2010/wordprocessingInk" xmlns:wne="http://schemas.microsoft.com/office/word/2006/wordml" xmlns:wps="http://schemas.microsoft.com/office/word/2010/wordprocessingShape" mc:Ignorable="w14 w15 w16se w16cid w16 w16cex w16sdtdh w16sdtfl w16du wp14">
   <w:p>
     <w:pPr>
-      <w:pStyle w:val="Fuzeile"/>
+      <w:pStyle w:val="LindeFuss"/>
       <w:spacing w:before="0" w:after="0" w:line="240" w:lineRule="auto"/>
       <w:jc w:val="center"/>
       <w:rPr>
         <w:rFonts w:ascii="Aptos" w:hAnsi="Aptos" w:cs="Aptos"/>
+        <w:color w:val="000000"/>
         <w:sz w:val="16"/>
         <w:szCs w:val="16"/>
       </w:rPr>
@@ -379,6 +460,7 @@
     <w:r>
       <w:rPr>
         <w:rFonts w:ascii="Aptos" w:hAnsi="Aptos" w:cs="Aptos"/>
+        <w:color w:val="000000"/>
         <w:sz w:val="16"/>
         <w:szCs w:val="16"/>
       </w:rPr>
@@ -411,8 +493,9 @@
 <w:hdr xmlns:a="http://schemas.openxmlformats.org/drawingml/2006/main" xmlns:a14="http://schemas.microsoft.com/office/drawing/2010/main" xmlns:mc="http://schemas.openxmlformats.org/markup-compatibility/2006" xmlns:pic="http://schemas.openxmlformats.org/drawingml/2006/picture" xmlns:r="http://schemas.openxmlformats.org/officeDocument/2006/relationships" xmlns:w="http://schemas.openxmlformats.org/wordprocessingml/2006/main" xmlns:w14="http://schemas.microsoft.com/office/word/2010/wordml" xmlns:wp="http://schemas.openxmlformats.org/drawingml/2006/wordprocessingDrawing" xmlns:wp14="http://schemas.microsoft.com/office/word/2010/wordprocessingDrawing" xmlns:wpc="http://schemas.microsoft.com/office/word/2010/wordprocessingCanvas" xmlns:cx="http://schemas.microsoft.com/office/drawing/2014/chartex" xmlns:cx1="http://schemas.microsoft.com/office/drawing/2015/9/8/chartex" xmlns:cx2="http://schemas.microsoft.com/office/drawing/2015/10/21/chartex" xmlns:cx3="http://schemas.microsoft.com/office/drawing/2016/5/9/chartex" xmlns:cx4="http://schemas.microsoft.com/office/drawing/2016/5/10/chartex" xmlns:cx5="http://schemas.microsoft.com/office/drawing/2016/5/11/chartex" xmlns:cx6="http://schemas.microsoft.com/office/drawing/2016/5/12/chartex" xmlns:cx7="http://schemas.microsoft.com/office/drawing/2016/5/13/chartex" xmlns:cx8="http://schemas.microsoft.com/office/drawing/2016/5/14/chartex" xmlns:aink="http://schemas.microsoft.com/office/drawing/2016/ink" xmlns:am3d="http://schemas.microsoft.com/office/drawing/2017/model3d" xmlns:o="urn:schemas-microsoft-com:office:office" xmlns:oel="http://schemas.microsoft.com/office/2019/extlst" xmlns:m="http://schemas.openxmlformats.org/officeDocument/2006/math" xmlns:v="urn:schemas-microsoft-com:vml" xmlns:w10="urn:schemas-microsoft-com:office:word" xmlns:w15="http://schemas.microsoft.com/office/word/2012/wordml" xmlns:w16cei="http://schemas.microsoft.com/office/word/2026/wordml/cei" xmlns:w16cex="http://schemas.microsoft.com/office/word/2018/wordml/cex" xmlns:w16cid="http://schemas.microsoft.com/office/word/2016/wordml/cid" xmlns:w16="http://schemas.microsoft.com/office/word/2018/wordml" xmlns:w16du="http://schemas.microsoft.com/office/word/2023/wordml/word16du" xmlns:w16sdtdh="http://schemas.microsoft.com/office/word/2020/wordml/sdtdatahash" xmlns:w16sdtfl="http://schemas.microsoft.com/office/word/2024/wordml/sdtformatlock" xmlns:w16se="http://schemas.microsoft.com/office/word/2015/wordml/symex" xmlns:wpg="http://schemas.microsoft.com/office/word/2010/wordprocessingGroup" xmlns:wpi="http://schemas.microsoft.com/office/word/2010/wordprocessingInk" xmlns:wne="http://schemas.microsoft.com/office/word/2006/wordml" xmlns:wps="http://schemas.microsoft.com/office/word/2010/wordprocessingShape" mc:Ignorable="w14 w15 w16se w16cid w16 w16cex w16sdtdh w16sdtfl w16du wp14">
   <w:p>
     <w:pPr>
-      <w:pStyle w:val="Kopfzeile"/>
+      <w:pStyle w:val="LindeKopf"/>
       <w:spacing w:before="0" w:after="0" w:line="240" w:lineRule="auto"/>
+      <w:jc w:val="center"/>
       <w:rPr>
         <w:rFonts w:ascii="Aptos" w:hAnsi="Aptos" w:cs="Aptos"/>
         <w:sz w:val="22"/>
@@ -425,7 +508,7 @@
       </w:rPr>
       <w:drawing>
         <wp:inline distT="0" distB="0" distL="0" distR="0">
-          <wp:extent cx="2769106" cy="1213215"/>
+          <wp:extent cx="2638425" cy="1155960"/>
           <wp:effectExtent l="0" t="0" r="0" b="0"/>
           <wp:docPr id="1" name="Logo" descr="Logo Betagtenzentrum Linde"/>
           <wp:cNvGraphicFramePr>
@@ -447,7 +530,7 @@
                 <pic:spPr>
                   <a:xfrm>
                     <a:off x="0" y="0"/>
-                    <a:ext cx="2769106" cy="1213215"/>
+                    <a:ext cx="2638425" cy="1155960"/>
                   </a:xfrm>
                   <a:prstGeom prst="rect">
                     <a:avLst/>
@@ -1229,6 +1312,50 @@
       <w:lang w:eastAsia="de-DE"/>
     </w:rPr>
   </w:style>
+  <w:style w:type="paragraph" w:customStyle="1" w:styleId="LindeBrief">
+    <w:name w:val="Linde Brief"/>
+    <w:basedOn w:val="Standard"/>
+    <w:qFormat/>
+    <w:pPr>
+      <w:spacing w:before="0" w:after="0" w:line="240" w:lineRule="auto"/>
+    </w:pPr>
+    <w:rPr>
+      <w:rFonts w:ascii="Aptos" w:hAnsi="Aptos" w:cs="Aptos"/>
+      <w:color w:val="000000"/>
+      <w:sz w:val="22"/>
+      <w:szCs w:val="22"/>
+    </w:rPr>
+  </w:style>
+  <w:style w:type="paragraph" w:customStyle="1" w:styleId="LindeBetreff">
+    <w:name w:val="Linde Betreff"/>
+    <w:basedOn w:val="LindeBrief"/>
+    <w:next w:val="LindeBrief"/>
+    <w:qFormat/>
+    <w:rPr>
+      <w:b/>
+      <w:bCs/>
+      <w:sz w:val="24"/>
+      <w:szCs w:val="24"/>
+    </w:rPr>
+  </w:style>
+  <w:style w:type="paragraph" w:customStyle="1" w:styleId="LindeKopf">
+    <w:name w:val="Linde Kopfzeile"/>
+    <w:basedOn w:val="LindeBrief"/>
+    <w:pPr>
+      <w:jc w:val="center"/>
+    </w:pPr>
+  </w:style>
+  <w:style w:type="paragraph" w:customStyle="1" w:styleId="LindeFuss">
+    <w:name w:val="Linde Fusszeile"/>
+    <w:basedOn w:val="LindeBrief"/>
+    <w:pPr>
+      <w:jc w:val="center"/>
+    </w:pPr>
+    <w:rPr>
+      <w:sz w:val="16"/>
+      <w:szCs w:val="16"/>
+    </w:rPr>
+  </w:style>
 </w:styles>
 </file>
 

</xml_diff>